<commit_message>
Fix to quotes, quotes_deliveryMethod and DB diagram. Shift drop FKs
</commit_message>
<xml_diff>
--- a/DB diagram.docx
+++ b/DB diagram.docx
@@ -11,10 +11,10 @@
           <w:noProof/>
         </w:rPr>
         <w:drawing>
-          <wp:inline distT="0" distB="0" distL="0" distR="0" wp14:anchorId="5856E00A" wp14:editId="68DAF0DA">
-            <wp:extent cx="9242475" cy="6898740"/>
-            <wp:effectExtent l="0" t="0" r="0" b="0"/>
-            <wp:docPr id="315188047" name="Picture 1"/>
+          <wp:inline distT="0" distB="0" distL="0" distR="0" wp14:anchorId="3F0752F2" wp14:editId="1D8119FE">
+            <wp:extent cx="9294857" cy="6940142"/>
+            <wp:effectExtent l="0" t="0" r="1905" b="0"/>
+            <wp:docPr id="409105994" name="Picture 1"/>
             <wp:cNvGraphicFramePr>
               <a:graphicFrameLocks xmlns:a="http://schemas.openxmlformats.org/drawingml/2006/main" noChangeAspect="1"/>
             </wp:cNvGraphicFramePr>
@@ -43,7 +43,7 @@
                   <pic:spPr bwMode="auto">
                     <a:xfrm>
                       <a:off x="0" y="0"/>
-                      <a:ext cx="9245169" cy="6900751"/>
+                      <a:ext cx="9301379" cy="6945012"/>
                     </a:xfrm>
                     <a:prstGeom prst="rect">
                       <a:avLst/>

</xml_diff>